<commit_message>
docs(experience): refresh Hypervisor office pack after story pointers
Co-authored-by: thibaud.ishacian <thibaud.ishacian@gmail.com>
</commit_message>
<xml_diff>
--- a/docs/agentium-hypervisor-decision-strategy.fr.docx
+++ b/docs/agentium-hypervisor-decision-strategy.fr.docx
@@ -187,6 +187,73 @@
           <w:sz w:val="22"/>
         </w:rPr>
         <w:t>implémentée, opt-in, non acceptée</w:t>
+      </w:r>
+      <w:r>
+        <w:rPr>
+          <w:rFonts w:ascii="Calibri" w:hAnsi="Calibri" w:eastAsia="Calibri"/>
+          <w:b w:val="0"/>
+          <w:i/>
+          <w:color w:val="596371"/>
+          <w:sz w:val="22"/>
+        </w:rPr>
+        <w:t>.</w:t>
+      </w:r>
+    </w:p>
+    <w:p>
+      <w:r>
+        <w:rPr>
+          <w:rFonts w:ascii="Calibri" w:hAnsi="Calibri" w:eastAsia="Calibri"/>
+          <w:b w:val="0"/>
+          <w:i w:val="0"/>
+          <w:color w:val="151A23"/>
+          <w:sz w:val="22"/>
+        </w:rPr>
+        <w:t>&gt;</w:t>
+      </w:r>
+    </w:p>
+    <w:p>
+      <w:pPr>
+        <w:ind w:left="340"/>
+      </w:pPr>
+      <w:r>
+        <w:rPr>
+          <w:rFonts w:ascii="Calibri" w:hAnsi="Calibri" w:eastAsia="Calibri"/>
+          <w:b w:val="0"/>
+          <w:i/>
+          <w:color w:val="596371"/>
+          <w:sz w:val="22"/>
+        </w:rPr>
+        <w:t xml:space="preserve">User stories (format papAI, objets Agentium) : </w:t>
+      </w:r>
+      <w:r>
+        <w:rPr>
+          <w:rFonts w:ascii="Calibri" w:hAnsi="Calibri" w:eastAsia="Calibri"/>
+          <w:b w:val="0"/>
+          <w:i/>
+          <w:color w:val="596371"/>
+          <w:sz w:val="22"/>
+        </w:rPr>
+        <w:t>`agentium-hypervisor-user-stories.md`</w:t>
+      </w:r>
+      <w:r>
+        <w:rPr>
+          <w:rFonts w:ascii="Calibri" w:hAnsi="Calibri" w:eastAsia="Calibri"/>
+          <w:b w:val="0"/>
+          <w:i/>
+          <w:color w:val="596371"/>
+          <w:sz w:val="22"/>
+        </w:rPr>
+        <w:t xml:space="preserve">, MVP COMEX </w:t>
+      </w:r>
+      <w:r>
+        <w:rPr>
+          <w:rFonts w:ascii="Calibri" w:hAnsi="Calibri" w:eastAsia="Calibri"/>
+          <w:b w:val="0"/>
+          <w:i/>
+          <w:color w:val="596371"/>
+          <w:sz w:val="22"/>
+        </w:rPr>
+        <w:t>`agentium-hypervisor-mvp-comex.md`</w:t>
       </w:r>
       <w:r>
         <w:rPr>

</xml_diff>